<commit_message>
Use Dayana Pictures letterhead for acceptance letter
Co-Authored-By: Claude Sonnet 5.5 <noreply@anthropic.com>
Claude-Session: https://claude.ai/code/session_0195BKT4bbUP8oTidmUW2rAQ
</commit_message>
<xml_diff>
--- a/documents/Letter_of_Acceptance_Muhammad_Rifqi_Ardiyanto.docx
+++ b/documents/Letter_of_Acceptance_Muhammad_Rifqi_Ardiyanto.docx
@@ -2,18 +2,6 @@
 <file path=word/document.xml><?xml version="1.0" encoding="utf-8"?>
 <w:document xmlns:wpc="http://schemas.microsoft.com/office/word/2010/wordprocessingCanvas" xmlns:mo="http://schemas.microsoft.com/office/mac/office/2008/main" xmlns:mc="http://schemas.openxmlformats.org/markup-compatibility/2006" xmlns:mv="urn:schemas-microsoft-com:mac:vml" xmlns:o="urn:schemas-microsoft-com:office:office" xmlns:r="http://schemas.openxmlformats.org/officeDocument/2006/relationships" xmlns:m="http://schemas.openxmlformats.org/officeDocument/2006/math" xmlns:v="urn:schemas-microsoft-com:vml" xmlns:wp14="http://schemas.microsoft.com/office/word/2010/wordprocessingDrawing" xmlns:wp="http://schemas.openxmlformats.org/drawingml/2006/wordprocessingDrawing" xmlns:w10="urn:schemas-microsoft-com:office:word" xmlns:w="http://schemas.openxmlformats.org/wordprocessingml/2006/main" xmlns:w14="http://schemas.microsoft.com/office/word/2010/wordml" xmlns:wpg="http://schemas.microsoft.com/office/word/2010/wordprocessingGroup" xmlns:wpi="http://schemas.microsoft.com/office/word/2010/wordprocessingInk" xmlns:wne="http://schemas.microsoft.com/office/word/2006/wordml" xmlns:wps="http://schemas.microsoft.com/office/word/2010/wordprocessingShape" mc:Ignorable="w14 wp14">
   <w:body>
-    <w:p>
-      <w:pPr>
-        <w:spacing w:after="280"/>
-        <w:jc w:val="center"/>
-      </w:pPr>
-      <w:r>
-        <w:rPr>
-          <w:b/>
-        </w:rPr>
-        <w:t>[KOP SURAT PERUSAHAAN / LOGO]</w:t>
-      </w:r>
-    </w:p>
     <w:p>
       <w:pPr>
         <w:spacing w:after="40"/>
@@ -35,18 +23,18 @@
         <w:rPr>
           <w:b w:val="0"/>
         </w:rPr>
-        <w:t>Nomor: [nomor surat]/LOA/[bulan romawi]/2026</w:t>
+        <w:t>Nomor: [nomor surat]/DP-LOA/X/2026</w:t>
       </w:r>
     </w:p>
     <w:p>
       <w:pPr>
-        <w:spacing w:after="200"/>
+        <w:spacing w:after="120"/>
       </w:pPr>
       <w:r>
         <w:rPr>
           <w:b w:val="0"/>
         </w:rPr>
-        <w:t>[Kota], 28 Oktober 2026</w:t>
+        <w:t>Yogyakarta, 28 Oktober 2026</w:t>
       </w:r>
     </w:p>
     <w:p>
@@ -95,7 +83,7 @@
     </w:p>
     <w:p>
       <w:pPr>
-        <w:spacing w:after="240"/>
+        <w:spacing w:after="160"/>
       </w:pPr>
       <w:r>
         <w:rPr>
@@ -106,7 +94,7 @@
     </w:p>
     <w:p>
       <w:pPr>
-        <w:spacing w:after="240"/>
+        <w:spacing w:after="160"/>
       </w:pPr>
       <w:r>
         <w:rPr>
@@ -117,7 +105,7 @@
     </w:p>
     <w:p>
       <w:pPr>
-        <w:spacing w:after="120"/>
+        <w:spacing w:after="80"/>
       </w:pPr>
       <w:r>
         <w:rPr>
@@ -128,31 +116,35 @@
     </w:p>
     <w:p>
       <w:pPr>
-        <w:spacing w:after="120"/>
+        <w:spacing w:after="80"/>
       </w:pPr>
       <w:r>
         <w:rPr>
           <w:b w:val="0"/>
         </w:rPr>
-        <w:t>Sehubungan dengan permohonan magang yang diajukan, bersama surat ini kami, [Nama Perusahaan], menyatakan bahwa mahasiswa berikut:</w:t>
+        <w:t>Sehubungan dengan permohonan magang yang diajukan, bersama surat ini kami, PT Dayana Kreativa Nusantara (Dayana Pictures), menyatakan bahwa mahasiswa berikut:</w:t>
       </w:r>
     </w:p>
     <w:tbl>
       <w:tblPr>
         <w:tblW w:type="auto" w:w="0"/>
+        <w:tblLayout w:type="fixed"/>
         <w:tblLook w:firstColumn="1" w:firstRow="1" w:lastColumn="0" w:lastRow="0" w:noHBand="0" w:noVBand="1" w:val="04A0"/>
       </w:tblPr>
       <w:tblGrid>
-        <w:gridCol w:w="3135"/>
-        <w:gridCol w:w="3135"/>
-        <w:gridCol w:w="3135"/>
+        <w:gridCol w:w="2041"/>
+        <w:gridCol w:w="283"/>
+        <w:gridCol w:w="6746"/>
       </w:tblGrid>
       <w:tr>
         <w:tc>
           <w:tcPr>
-            <w:tcW w:type="dxa" w:w="2268"/>
+            <w:tcW w:type="dxa" w:w="2041"/>
           </w:tcPr>
           <w:p>
+            <w:pPr>
+              <w:spacing w:after="0"/>
+            </w:pPr>
             <w:r>
               <w:t>Nama</w:t>
             </w:r>
@@ -163,6 +155,9 @@
             <w:tcW w:type="dxa" w:w="283"/>
           </w:tcPr>
           <w:p>
+            <w:pPr>
+              <w:spacing w:after="0"/>
+            </w:pPr>
             <w:r>
               <w:t>:</w:t>
             </w:r>
@@ -170,9 +165,12 @@
         </w:tc>
         <w:tc>
           <w:tcPr>
-            <w:tcW w:type="dxa" w:w="6520"/>
+            <w:tcW w:type="dxa" w:w="6746"/>
           </w:tcPr>
           <w:p>
+            <w:pPr>
+              <w:spacing w:after="0"/>
+            </w:pPr>
             <w:r>
               <w:t>Muhammad Rifqi Ardiyanto</w:t>
             </w:r>
@@ -182,9 +180,12 @@
       <w:tr>
         <w:tc>
           <w:tcPr>
-            <w:tcW w:type="dxa" w:w="2268"/>
+            <w:tcW w:type="dxa" w:w="2041"/>
           </w:tcPr>
           <w:p>
+            <w:pPr>
+              <w:spacing w:after="0"/>
+            </w:pPr>
             <w:r>
               <w:t>NIM</w:t>
             </w:r>
@@ -195,6 +196,9 @@
             <w:tcW w:type="dxa" w:w="283"/>
           </w:tcPr>
           <w:p>
+            <w:pPr>
+              <w:spacing w:after="0"/>
+            </w:pPr>
             <w:r>
               <w:t>:</w:t>
             </w:r>
@@ -202,9 +206,12 @@
         </w:tc>
         <w:tc>
           <w:tcPr>
-            <w:tcW w:type="dxa" w:w="6520"/>
+            <w:tcW w:type="dxa" w:w="6746"/>
           </w:tcPr>
           <w:p>
+            <w:pPr>
+              <w:spacing w:after="0"/>
+            </w:pPr>
             <w:r>
               <w:t>231481051</w:t>
             </w:r>
@@ -214,9 +221,12 @@
       <w:tr>
         <w:tc>
           <w:tcPr>
-            <w:tcW w:type="dxa" w:w="2268"/>
+            <w:tcW w:type="dxa" w:w="2041"/>
           </w:tcPr>
           <w:p>
+            <w:pPr>
+              <w:spacing w:after="0"/>
+            </w:pPr>
             <w:r>
               <w:t>Program Studi</w:t>
             </w:r>
@@ -227,6 +237,9 @@
             <w:tcW w:type="dxa" w:w="283"/>
           </w:tcPr>
           <w:p>
+            <w:pPr>
+              <w:spacing w:after="0"/>
+            </w:pPr>
             <w:r>
               <w:t>:</w:t>
             </w:r>
@@ -234,9 +247,12 @@
         </w:tc>
         <w:tc>
           <w:tcPr>
-            <w:tcW w:type="dxa" w:w="6520"/>
+            <w:tcW w:type="dxa" w:w="6746"/>
           </w:tcPr>
           <w:p>
+            <w:pPr>
+              <w:spacing w:after="0"/>
+            </w:pPr>
             <w:r>
               <w:t>Film dan Televisi</w:t>
             </w:r>
@@ -246,9 +262,12 @@
       <w:tr>
         <w:tc>
           <w:tcPr>
-            <w:tcW w:type="dxa" w:w="2268"/>
+            <w:tcW w:type="dxa" w:w="2041"/>
           </w:tcPr>
           <w:p>
+            <w:pPr>
+              <w:spacing w:after="0"/>
+            </w:pPr>
             <w:r>
               <w:t>Jurusan</w:t>
             </w:r>
@@ -259,6 +278,9 @@
             <w:tcW w:type="dxa" w:w="283"/>
           </w:tcPr>
           <w:p>
+            <w:pPr>
+              <w:spacing w:after="0"/>
+            </w:pPr>
             <w:r>
               <w:t>:</w:t>
             </w:r>
@@ -266,9 +288,12 @@
         </w:tc>
         <w:tc>
           <w:tcPr>
-            <w:tcW w:type="dxa" w:w="6520"/>
+            <w:tcW w:type="dxa" w:w="6746"/>
           </w:tcPr>
           <w:p>
+            <w:pPr>
+              <w:spacing w:after="0"/>
+            </w:pPr>
             <w:r>
               <w:t>Seni Media Rekam</w:t>
             </w:r>
@@ -278,9 +303,12 @@
       <w:tr>
         <w:tc>
           <w:tcPr>
-            <w:tcW w:type="dxa" w:w="2268"/>
+            <w:tcW w:type="dxa" w:w="2041"/>
           </w:tcPr>
           <w:p>
+            <w:pPr>
+              <w:spacing w:after="0"/>
+            </w:pPr>
             <w:r>
               <w:t>Fakultas</w:t>
             </w:r>
@@ -291,6 +319,9 @@
             <w:tcW w:type="dxa" w:w="283"/>
           </w:tcPr>
           <w:p>
+            <w:pPr>
+              <w:spacing w:after="0"/>
+            </w:pPr>
             <w:r>
               <w:t>:</w:t>
             </w:r>
@@ -298,9 +329,12 @@
         </w:tc>
         <w:tc>
           <w:tcPr>
-            <w:tcW w:type="dxa" w:w="6520"/>
+            <w:tcW w:type="dxa" w:w="6746"/>
           </w:tcPr>
           <w:p>
+            <w:pPr>
+              <w:spacing w:after="0"/>
+            </w:pPr>
             <w:r>
               <w:t>Seni Rupa dan Desain</w:t>
             </w:r>
@@ -310,9 +344,12 @@
       <w:tr>
         <w:tc>
           <w:tcPr>
-            <w:tcW w:type="dxa" w:w="2268"/>
+            <w:tcW w:type="dxa" w:w="2041"/>
           </w:tcPr>
           <w:p>
+            <w:pPr>
+              <w:spacing w:after="0"/>
+            </w:pPr>
             <w:r>
               <w:t>Perguruan Tinggi</w:t>
             </w:r>
@@ -323,6 +360,9 @@
             <w:tcW w:type="dxa" w:w="283"/>
           </w:tcPr>
           <w:p>
+            <w:pPr>
+              <w:spacing w:after="0"/>
+            </w:pPr>
             <w:r>
               <w:t>:</w:t>
             </w:r>
@@ -330,9 +370,12 @@
         </w:tc>
         <w:tc>
           <w:tcPr>
-            <w:tcW w:type="dxa" w:w="6520"/>
+            <w:tcW w:type="dxa" w:w="6746"/>
           </w:tcPr>
           <w:p>
+            <w:pPr>
+              <w:spacing w:after="0"/>
+            </w:pPr>
             <w:r>
               <w:t>Institut Seni Indonesia Surakarta</w:t>
             </w:r>
@@ -342,9 +385,12 @@
       <w:tr>
         <w:tc>
           <w:tcPr>
-            <w:tcW w:type="dxa" w:w="2268"/>
+            <w:tcW w:type="dxa" w:w="2041"/>
           </w:tcPr>
           <w:p>
+            <w:pPr>
+              <w:spacing w:after="0"/>
+            </w:pPr>
             <w:r>
               <w:t>Alamat</w:t>
             </w:r>
@@ -355,6 +401,9 @@
             <w:tcW w:type="dxa" w:w="283"/>
           </w:tcPr>
           <w:p>
+            <w:pPr>
+              <w:spacing w:after="0"/>
+            </w:pPr>
             <w:r>
               <w:t>:</w:t>
             </w:r>
@@ -362,9 +411,12 @@
         </w:tc>
         <w:tc>
           <w:tcPr>
-            <w:tcW w:type="dxa" w:w="6520"/>
+            <w:tcW w:type="dxa" w:w="6746"/>
           </w:tcPr>
           <w:p>
+            <w:pPr>
+              <w:spacing w:after="0"/>
+            </w:pPr>
             <w:r>
               <w:t>Jl. Brig. S. Riyadi II/10, Ds. Sokanegara, Rt. 01 Rw. 01, Kec. Purwokerto Timur, Kab. Banyumas, Jawa Tengah</w:t>
             </w:r>
@@ -374,7 +426,7 @@
     </w:tbl>
     <w:p>
       <w:pPr>
-        <w:spacing w:after="80"/>
+        <w:spacing w:after="40"/>
       </w:pPr>
       <w:r>
         <w:rPr>
@@ -384,7 +436,7 @@
     </w:p>
     <w:p>
       <w:pPr>
-        <w:spacing w:after="120"/>
+        <w:spacing w:after="80"/>
       </w:pPr>
       <w:r>
         <w:rPr>
@@ -450,7 +502,7 @@
     </w:p>
     <w:p>
       <w:pPr>
-        <w:spacing w:after="120"/>
+        <w:spacing w:after="80"/>
       </w:pPr>
       <w:r>
         <w:rPr>
@@ -461,7 +513,7 @@
     </w:p>
     <w:p>
       <w:pPr>
-        <w:spacing w:after="360"/>
+        <w:spacing w:after="120"/>
       </w:pPr>
       <w:r>
         <w:rPr>
@@ -483,13 +535,13 @@
     </w:p>
     <w:p>
       <w:pPr>
-        <w:spacing w:after="1000"/>
+        <w:spacing w:after="720"/>
       </w:pPr>
       <w:r>
         <w:rPr>
           <w:b/>
         </w:rPr>
-        <w:t>[Nama Perusahaan]</w:t>
+        <w:t>PT Dayana Kreativa Nusantara</w:t>
       </w:r>
     </w:p>
     <w:p>
@@ -522,17 +574,63 @@
         <w:rPr>
           <w:b w:val="0"/>
         </w:rPr>
-        <w:t>[Kontak: email / telepon]</w:t>
+        <w:t>hello.dayanacreative@gmail.com / +62 821-3719-2219</w:t>
       </w:r>
     </w:p>
     <w:sectPr>
+      <w:headerReference w:type="default" r:id="rId9"/>
       <w:pgSz w:w="12240" w:h="15840"/>
-      <w:pgMar w:top="1247" w:right="1417" w:bottom="1247" w:left="1417" w:header="720" w:footer="720" w:gutter="0"/>
+      <w:pgMar w:top="1928" w:right="1304" w:bottom="737" w:left="1304" w:header="567" w:footer="720" w:gutter="0"/>
       <w:cols w:space="720"/>
       <w:docGrid w:linePitch="360"/>
     </w:sectPr>
   </w:body>
 </w:document>
+</file>
+
+<file path=word/header1.xml><?xml version="1.0" encoding="utf-8"?>
+<w:hdr xmlns:m="http://schemas.openxmlformats.org/officeDocument/2006/math" xmlns:mc="http://schemas.openxmlformats.org/markup-compatibility/2006" xmlns:mo="http://schemas.microsoft.com/office/mac/office/2008/main" xmlns:mv="urn:schemas-microsoft-com:mac:vml" xmlns:o="urn:schemas-microsoft-com:office:office" xmlns:r="http://schemas.openxmlformats.org/officeDocument/2006/relationships" xmlns:v="urn:schemas-microsoft-com:vml" xmlns:w10="urn:schemas-microsoft-com:office:word" xmlns:w14="http://schemas.microsoft.com/office/word/2010/wordml" xmlns:w="http://schemas.openxmlformats.org/wordprocessingml/2006/main" xmlns:wne="http://schemas.microsoft.com/office/word/2006/wordml" xmlns:wp14="http://schemas.microsoft.com/office/word/2010/wordprocessingDrawing" xmlns:wp="http://schemas.openxmlformats.org/drawingml/2006/wordprocessingDrawing" xmlns:wpc="http://schemas.microsoft.com/office/word/2010/wordprocessingCanvas" xmlns:wpg="http://schemas.microsoft.com/office/word/2010/wordprocessingGroup" xmlns:wpi="http://schemas.microsoft.com/office/word/2010/wordprocessingInk" xmlns:wps="http://schemas.microsoft.com/office/word/2010/wordprocessingShape" mc:Ignorable="w14 wp14">
+  <w:p>
+    <w:pPr>
+      <w:pStyle w:val="Header"/>
+      <w:jc w:val="center"/>
+    </w:pPr>
+    <w:r>
+      <w:drawing>
+        <wp:inline xmlns:a="http://schemas.openxmlformats.org/drawingml/2006/main" xmlns:pic="http://schemas.openxmlformats.org/drawingml/2006/picture">
+          <wp:extent cx="5220000" cy="1260870"/>
+          <wp:docPr id="1" name="Picture 1"/>
+          <wp:cNvGraphicFramePr>
+            <a:graphicFrameLocks noChangeAspect="1"/>
+          </wp:cNvGraphicFramePr>
+          <a:graphic>
+            <a:graphicData uri="http://schemas.openxmlformats.org/drawingml/2006/picture">
+              <pic:pic>
+                <pic:nvPicPr>
+                  <pic:cNvPr id="0" name="kop_crop.png"/>
+                  <pic:cNvPicPr/>
+                </pic:nvPicPr>
+                <pic:blipFill>
+                  <a:blip r:embed="rId1"/>
+                  <a:stretch>
+                    <a:fillRect/>
+                  </a:stretch>
+                </pic:blipFill>
+                <pic:spPr>
+                  <a:xfrm>
+                    <a:off x="0" y="0"/>
+                    <a:ext cx="5220000" cy="1260870"/>
+                  </a:xfrm>
+                  <a:prstGeom prst="rect"/>
+                </pic:spPr>
+              </pic:pic>
+            </a:graphicData>
+          </a:graphic>
+        </wp:inline>
+      </w:drawing>
+    </w:r>
+  </w:p>
+</w:hdr>
 </file>
 
 <file path=word/numbering.xml><?xml version="1.0" encoding="utf-8"?>
@@ -898,9 +996,12 @@
     <w:name w:val="Normal"/>
     <w:qFormat/>
     <w:rsid w:val="00FC693F"/>
+    <w:pPr>
+      <w:spacing w:line="240" w:lineRule="auto"/>
+    </w:pPr>
     <w:rPr>
       <w:rFonts w:ascii="Times New Roman" w:hAnsi="Times New Roman"/>
-      <w:sz w:val="24"/>
+      <w:sz w:val="21"/>
     </w:rPr>
   </w:style>
   <w:style w:type="paragraph" w:styleId="Header">

</xml_diff>

<commit_message>
Add CEO signature and internship supervisor to acceptance letter
Co-Authored-By: Claude Sonnet 5.5 <noreply@anthropic.com>
Claude-Session: https://claude.ai/code/session_0195BKT4bbUP8oTidmUW2rAQ
</commit_message>
<xml_diff>
--- a/documents/Letter_of_Acceptance_Muhammad_Rifqi_Ardiyanto.docx
+++ b/documents/Letter_of_Acceptance_Muhammad_Rifqi_Ardiyanto.docx
@@ -487,7 +487,7 @@
         <w:spacing w:after="60"/>
       </w:pPr>
       <w:r>
-        <w:t>Pembimbing lapangan: [nama, jabatan].</w:t>
+        <w:t>Pembimbing lapangan: Raihan Adiputra, Chief Operations Officer.</w:t>
       </w:r>
     </w:p>
     <w:p>
@@ -535,13 +535,49 @@
     </w:p>
     <w:p>
       <w:pPr>
-        <w:spacing w:after="720"/>
+        <w:spacing w:after="40"/>
       </w:pPr>
       <w:r>
         <w:rPr>
           <w:b/>
         </w:rPr>
         <w:t>PT Dayana Kreativa Nusantara</w:t>
+      </w:r>
+    </w:p>
+    <w:p>
+      <w:r>
+        <w:drawing>
+          <wp:inline xmlns:a="http://schemas.openxmlformats.org/drawingml/2006/main" xmlns:pic="http://schemas.openxmlformats.org/drawingml/2006/picture">
+            <wp:extent cx="804622" cy="720000"/>
+            <wp:docPr id="1" name="Picture 1"/>
+            <wp:cNvGraphicFramePr>
+              <a:graphicFrameLocks noChangeAspect="1"/>
+            </wp:cNvGraphicFramePr>
+            <a:graphic>
+              <a:graphicData uri="http://schemas.openxmlformats.org/drawingml/2006/picture">
+                <pic:pic>
+                  <pic:nvPicPr>
+                    <pic:cNvPr id="0" name="ttd_rafi.png"/>
+                    <pic:cNvPicPr/>
+                  </pic:nvPicPr>
+                  <pic:blipFill>
+                    <a:blip r:embed="rId10"/>
+                    <a:stretch>
+                      <a:fillRect/>
+                    </a:stretch>
+                  </pic:blipFill>
+                  <pic:spPr>
+                    <a:xfrm>
+                      <a:off x="0" y="0"/>
+                      <a:ext cx="804622" cy="720000"/>
+                    </a:xfrm>
+                    <a:prstGeom prst="rect"/>
+                  </pic:spPr>
+                </pic:pic>
+              </a:graphicData>
+            </a:graphic>
+          </wp:inline>
+        </w:drawing>
       </w:r>
     </w:p>
     <w:p>
@@ -552,7 +588,7 @@
         <w:rPr>
           <w:b/>
         </w:rPr>
-        <w:t>[Nama Penandatangan]</w:t>
+        <w:t>Rafi [nama lengkap]</w:t>
       </w:r>
     </w:p>
     <w:p>
@@ -563,7 +599,7 @@
         <w:rPr>
           <w:b w:val="0"/>
         </w:rPr>
-        <w:t>[Jabatan]</w:t>
+        <w:t>Chief Executive Officer</w:t>
       </w:r>
     </w:p>
     <w:p>

</xml_diff>

<commit_message>
Fill work hours, location, signatory name and updated signature
Co-Authored-By: Claude Sonnet 5.5 <noreply@anthropic.com>
Claude-Session: https://claude.ai/code/session_0195BKT4bbUP8oTidmUW2rAQ
</commit_message>
<xml_diff>
--- a/documents/Letter_of_Acceptance_Muhammad_Rifqi_Ardiyanto.docx
+++ b/documents/Letter_of_Acceptance_Muhammad_Rifqi_Ardiyanto.docx
@@ -442,7 +442,7 @@
         <w:rPr>
           <w:b w:val="0"/>
         </w:rPr>
-        <w:t>DITERIMA untuk melaksanakan program magang di perusahaan kami sebagai Junior Creative Director pada divisi [Nama Divisi/Departemen], dengan ketentuan sebagai berikut:</w:t>
+        <w:t>DITERIMA untuk melaksanakan program magang di perusahaan kami sebagai Junior Creative Director, dengan ketentuan sebagai berikut:</w:t>
       </w:r>
     </w:p>
     <w:p>
@@ -460,7 +460,7 @@
         <w:spacing w:after="60"/>
       </w:pPr>
       <w:r>
-        <w:t>Jam kerja: [hari], pukul [jam mulai] – [jam selesai] WIB, dengan sistem [WFO/WFH/Hybrid].</w:t>
+        <w:t>Jam kerja: Senin sampai Jumat, pukul 09.00 sampai dengan 17.00 WIB, dengan sistem WFO &amp; WFA (Hybrid).</w:t>
       </w:r>
     </w:p>
     <w:p>
@@ -469,7 +469,7 @@
         <w:spacing w:after="60"/>
       </w:pPr>
       <w:r>
-        <w:t>Lokasi penempatan: [alamat kantor / remote].</w:t>
+        <w:t>Lokasi penempatan: PT Dayana Kreativa Nusantara, Pelemsewu, Panggungharjo, Sewon, Bantul, Daerah Istimewa Yogyakarta.</w:t>
       </w:r>
     </w:p>
     <w:p>
@@ -548,7 +548,7 @@
       <w:r>
         <w:drawing>
           <wp:inline xmlns:a="http://schemas.openxmlformats.org/drawingml/2006/main" xmlns:pic="http://schemas.openxmlformats.org/drawingml/2006/picture">
-            <wp:extent cx="804622" cy="720000"/>
+            <wp:extent cx="682850" cy="612000"/>
             <wp:docPr id="1" name="Picture 1"/>
             <wp:cNvGraphicFramePr>
               <a:graphicFrameLocks noChangeAspect="1"/>
@@ -569,7 +569,7 @@
                   <pic:spPr>
                     <a:xfrm>
                       <a:off x="0" y="0"/>
-                      <a:ext cx="804622" cy="720000"/>
+                      <a:ext cx="682850" cy="612000"/>
                     </a:xfrm>
                     <a:prstGeom prst="rect"/>
                   </pic:spPr>
@@ -588,7 +588,7 @@
         <w:rPr>
           <w:b/>
         </w:rPr>
-        <w:t>Rafi [nama lengkap]</w:t>
+        <w:t>Rafi Putra</w:t>
       </w:r>
     </w:p>
     <w:p>
@@ -616,7 +616,7 @@
     <w:sectPr>
       <w:headerReference w:type="default" r:id="rId9"/>
       <w:pgSz w:w="12240" w:h="15840"/>
-      <w:pgMar w:top="1928" w:right="1304" w:bottom="737" w:left="1304" w:header="567" w:footer="720" w:gutter="0"/>
+      <w:pgMar w:top="1871" w:right="1304" w:bottom="567" w:left="1304" w:header="567" w:footer="720" w:gutter="0"/>
       <w:cols w:space="720"/>
       <w:docGrid w:linePitch="360"/>
     </w:sectPr>

</xml_diff>